<commit_message>
Fix report cover text and refresh final PDF
</commit_message>
<xml_diff>
--- a/thesis/doc/BaoCao_DoAn_AppleStore_HoanThien_20260720.docx
+++ b/thesis/doc/BaoCao_DoAn_AppleStore_HoanThien_20260720.docx
@@ -314,7 +314,7 @@
           <w:i/>
           <w:szCs w:val="26"/>
         </w:rPr>
-        <w:t>Trà Vinh, tháng</w:t>
+        <w:t xml:space="preserve">Trà Vinh, tháng </w:t>
       </w:r>
       <w:r>
         <w:rPr>
@@ -329,7 +329,7 @@
           <w:i/>
           <w:szCs w:val="26"/>
         </w:rPr>
-        <w:t xml:space="preserve"> năm</w:t>
+        <w:t xml:space="preserve"> năm </w:t>
       </w:r>
       <w:r>
         <w:rPr>
@@ -414,7 +414,6 @@
           <w:szCs w:val="26"/>
           <w:lang w:val="vi-VN"/>
         </w:rPr>
-        <w:t>s</w:t>
       </w:r>
       <w:r>
         <w:rPr>
@@ -628,7 +627,7 @@
           <w:b/>
           <w:sz w:val="28"/>
         </w:rPr>
-        <w:t>Sinh viên thực hiện    :</w:t>
+        <w:t xml:space="preserve">Sinh viên thực hiện    : </w:t>
       </w:r>
       <w:r>
         <w:rPr>
@@ -643,7 +642,7 @@
           <w:sz w:val="28"/>
           <w:lang w:val="vi-VN"/>
         </w:rPr>
-        <w:t>ồ NgọcTrai</w:t>
+        <w:t>ồ Ngọc Trai</w:t>
       </w:r>
     </w:p>
     <w:p>

</xml_diff>